<commit_message>
update: Trabalho Final: Prototipagem Eletromecânica
</commit_message>
<xml_diff>
--- a/1-Prototipagem-Eletromecanica/Trabalho-ELT532-Cintia.docx
+++ b/1-Prototipagem-Eletromecanica/Trabalho-ELT532-Cintia.docx
@@ -2,98 +2,301 @@
 <file path=word/document.xml><?xml version="1.0" encoding="utf-8"?>
 <w:document xmlns:wpc="http://schemas.microsoft.com/office/word/2010/wordprocessingCanvas" xmlns:cx="http://schemas.microsoft.com/office/drawing/2014/chartex" xmlns:cx1="http://schemas.microsoft.com/office/drawing/2015/9/8/chartex" xmlns:cx2="http://schemas.microsoft.com/office/drawing/2015/10/21/chartex" xmlns:cx3="http://schemas.microsoft.com/office/drawing/2016/5/9/chartex" xmlns:cx4="http://schemas.microsoft.com/office/drawing/2016/5/10/chartex" xmlns:cx5="http://schemas.microsoft.com/office/drawing/2016/5/11/chartex" xmlns:cx6="http://schemas.microsoft.com/office/drawing/2016/5/12/chartex" xmlns:cx7="http://schemas.microsoft.com/office/drawing/2016/5/13/chartex" xmlns:cx8="http://schemas.microsoft.com/office/drawing/2016/5/14/chartex" xmlns:mc="http://schemas.openxmlformats.org/markup-compatibility/2006" xmlns:aink="http://schemas.microsoft.com/office/drawing/2016/ink" xmlns:am3d="http://schemas.microsoft.com/office/drawing/2017/model3d" xmlns:o="urn:schemas-microsoft-com:office:office" xmlns:oel="http://schemas.microsoft.com/office/2019/extlst" xmlns:r="http://schemas.openxmlformats.org/officeDocument/2006/relationships" xmlns:m="http://schemas.openxmlformats.org/officeDocument/2006/math" xmlns:v="urn:schemas-microsoft-com:vml" xmlns:wp14="http://schemas.microsoft.com/office/word/2010/wordprocessingDrawing" xmlns:wp="http://schemas.openxmlformats.org/drawingml/2006/wordprocessingDrawing" xmlns:w10="urn:schemas-microsoft-com:office:word" xmlns:w="http://schemas.openxmlformats.org/wordprocessingml/2006/main" xmlns:w14="http://schemas.microsoft.com/office/word/2010/wordml" xmlns:w15="http://schemas.microsoft.com/office/word/2012/wordml" xmlns:w16cex="http://schemas.microsoft.com/office/word/2018/wordml/cex" xmlns:w16cid="http://schemas.microsoft.com/office/word/2016/wordml/cid" xmlns:w16="http://schemas.microsoft.com/office/word/2018/wordml" xmlns:w16du="http://schemas.microsoft.com/office/word/2023/wordml/word16du" xmlns:w16sdtdh="http://schemas.microsoft.com/office/word/2020/wordml/sdtdatahash" xmlns:w16sdtfl="http://schemas.microsoft.com/office/word/2024/wordml/sdtformatlock" xmlns:w16se="http://schemas.microsoft.com/office/word/2015/wordml/symex" xmlns:wpg="http://schemas.microsoft.com/office/word/2010/wordprocessingGroup" xmlns:wpi="http://schemas.microsoft.com/office/word/2010/wordprocessingInk" xmlns:wne="http://schemas.microsoft.com/office/word/2006/wordml" xmlns:wps="http://schemas.microsoft.com/office/word/2010/wordprocessingShape" mc:Ignorable="w14 w15 w16se w16cid w16 w16cex w16sdtdh w16sdtfl w16du wp14">
   <w:body>
+    <w:tbl>
+      <w:tblPr>
+        <w:tblStyle w:val="TableGrid"/>
+        <w:tblW w:w="0" w:type="auto"/>
+        <w:tblBorders>
+          <w:top w:val="none" w:sz="0" w:space="0" w:color="auto"/>
+          <w:left w:val="none" w:sz="0" w:space="0" w:color="auto"/>
+          <w:bottom w:val="none" w:sz="0" w:space="0" w:color="auto"/>
+          <w:right w:val="none" w:sz="0" w:space="0" w:color="auto"/>
+          <w:insideH w:val="none" w:sz="0" w:space="0" w:color="auto"/>
+          <w:insideV w:val="none" w:sz="0" w:space="0" w:color="auto"/>
+        </w:tblBorders>
+        <w:tblLook w:val="04A0" w:firstRow="1" w:lastRow="0" w:firstColumn="1" w:lastColumn="0" w:noHBand="0" w:noVBand="1"/>
+      </w:tblPr>
+      <w:tblGrid>
+        <w:gridCol w:w="2263"/>
+        <w:gridCol w:w="6509"/>
+      </w:tblGrid>
+      <w:tr>
+        <w:tc>
+          <w:tcPr>
+            <w:tcW w:w="2263" w:type="dxa"/>
+            <w:vAlign w:val="center"/>
+          </w:tcPr>
+          <w:p>
+            <w:pPr>
+              <w:jc w:val="center"/>
+              <w:rPr>
+                <w:rFonts w:ascii="Didot" w:hAnsi="Didot" w:cs="Didot"/>
+                <w:sz w:val="40"/>
+                <w:szCs w:val="40"/>
+              </w:rPr>
+            </w:pPr>
+            <w:r>
+              <w:rPr>
+                <w:rFonts w:ascii="Didot" w:hAnsi="Didot" w:cs="Didot"/>
+                <w:noProof/>
+                <w:sz w:val="40"/>
+                <w:szCs w:val="40"/>
+              </w:rPr>
+              <w:drawing>
+                <wp:inline distT="0" distB="0" distL="0" distR="0" wp14:anchorId="76792A21" wp14:editId="032D821D">
+                  <wp:extent cx="1130396" cy="887506"/>
+                  <wp:effectExtent l="0" t="0" r="0" b="1905"/>
+                  <wp:docPr id="1051326039" name="Picture 1" descr="A close up of a sign&#10;&#10;AI-generated content may be incorrect."/>
+                  <wp:cNvGraphicFramePr>
+                    <a:graphicFrameLocks xmlns:a="http://schemas.openxmlformats.org/drawingml/2006/main" noChangeAspect="1"/>
+                  </wp:cNvGraphicFramePr>
+                  <a:graphic xmlns:a="http://schemas.openxmlformats.org/drawingml/2006/main">
+                    <a:graphicData uri="http://schemas.openxmlformats.org/drawingml/2006/picture">
+                      <pic:pic xmlns:pic="http://schemas.openxmlformats.org/drawingml/2006/picture">
+                        <pic:nvPicPr>
+                          <pic:cNvPr id="1051326039" name="Picture 1" descr="A close up of a sign&#10;&#10;AI-generated content may be incorrect."/>
+                          <pic:cNvPicPr/>
+                        </pic:nvPicPr>
+                        <pic:blipFill>
+                          <a:blip r:embed="rId4" cstate="print">
+                            <a:extLst>
+                              <a:ext uri="{28A0092B-C50C-407E-A947-70E740481C1C}">
+                                <a14:useLocalDpi xmlns:a14="http://schemas.microsoft.com/office/drawing/2010/main" val="0"/>
+                              </a:ext>
+                            </a:extLst>
+                          </a:blip>
+                          <a:stretch>
+                            <a:fillRect/>
+                          </a:stretch>
+                        </pic:blipFill>
+                        <pic:spPr>
+                          <a:xfrm>
+                            <a:off x="0" y="0"/>
+                            <a:ext cx="1180695" cy="926997"/>
+                          </a:xfrm>
+                          <a:prstGeom prst="rect">
+                            <a:avLst/>
+                          </a:prstGeom>
+                        </pic:spPr>
+                      </pic:pic>
+                    </a:graphicData>
+                  </a:graphic>
+                </wp:inline>
+              </w:drawing>
+            </w:r>
+          </w:p>
+        </w:tc>
+        <w:tc>
+          <w:tcPr>
+            <w:tcW w:w="6509" w:type="dxa"/>
+          </w:tcPr>
+          <w:p>
+            <w:pPr>
+              <w:rPr>
+                <w:rFonts w:ascii="Didot" w:hAnsi="Didot" w:cs="Didot"/>
+              </w:rPr>
+            </w:pPr>
+            <w:r>
+              <w:rPr>
+                <w:rFonts w:ascii="Didot" w:hAnsi="Didot" w:cs="Didot" w:hint="cs"/>
+              </w:rPr>
+              <w:t>UFV - Universidade Federal de Viçosa</w:t>
+            </w:r>
+          </w:p>
+          <w:p>
+            <w:pPr>
+              <w:rPr>
+                <w:rFonts w:ascii="Didot" w:hAnsi="Didot" w:cs="Didot"/>
+              </w:rPr>
+            </w:pPr>
+          </w:p>
+          <w:p>
+            <w:pPr>
+              <w:rPr>
+                <w:rFonts w:ascii="Didot" w:hAnsi="Didot" w:cs="Didot"/>
+              </w:rPr>
+            </w:pPr>
+            <w:r>
+              <w:rPr>
+                <w:rFonts w:ascii="Didot" w:hAnsi="Didot" w:cs="Didot"/>
+              </w:rPr>
+              <w:t>Disciplina: ELT 532 - Prototipagem Eletromecânica</w:t>
+            </w:r>
+          </w:p>
+          <w:p>
+            <w:pPr>
+              <w:rPr>
+                <w:rFonts w:ascii="Didot" w:hAnsi="Didot" w:cs="Didot"/>
+              </w:rPr>
+            </w:pPr>
+            <w:r>
+              <w:rPr>
+                <w:rFonts w:ascii="Didot" w:hAnsi="Didot" w:cs="Didot"/>
+              </w:rPr>
+              <w:t xml:space="preserve">Discente: Cintia </w:t>
+            </w:r>
+            <w:proofErr w:type="spellStart"/>
+            <w:r>
+              <w:rPr>
+                <w:rFonts w:ascii="Didot" w:hAnsi="Didot" w:cs="Didot"/>
+              </w:rPr>
+              <w:t>Izumi</w:t>
+            </w:r>
+            <w:proofErr w:type="spellEnd"/>
+            <w:r>
+              <w:rPr>
+                <w:rFonts w:ascii="Didot" w:hAnsi="Didot" w:cs="Didot"/>
+              </w:rPr>
+              <w:t xml:space="preserve"> Shinoda</w:t>
+            </w:r>
+          </w:p>
+          <w:p>
+            <w:pPr>
+              <w:rPr>
+                <w:rFonts w:ascii="Didot" w:hAnsi="Didot" w:cs="Didot"/>
+              </w:rPr>
+            </w:pPr>
+            <w:r>
+              <w:rPr>
+                <w:rFonts w:ascii="Didot" w:hAnsi="Didot" w:cs="Didot"/>
+              </w:rPr>
+              <w:t>Matrícula:</w:t>
+            </w:r>
+          </w:p>
+          <w:p>
+            <w:pPr>
+              <w:jc w:val="right"/>
+              <w:rPr>
+                <w:rFonts w:ascii="Didot" w:hAnsi="Didot" w:cs="Didot"/>
+              </w:rPr>
+            </w:pPr>
+            <w:r>
+              <w:rPr>
+                <w:rFonts w:ascii="Didot" w:hAnsi="Didot" w:cs="Didot"/>
+              </w:rPr>
+              <w:t>Outubro / 2025</w:t>
+            </w:r>
+          </w:p>
+        </w:tc>
+      </w:tr>
+    </w:tbl>
+    <w:p>
+      <w:pPr>
+        <w:rPr>
+          <w:rFonts w:ascii="Didot" w:hAnsi="Didot" w:cs="Didot"/>
+        </w:rPr>
+      </w:pPr>
+    </w:p>
+    <w:p>
+      <w:pPr>
+        <w:rPr>
+          <w:rFonts w:ascii="Didot" w:hAnsi="Didot" w:cs="Didot"/>
+        </w:rPr>
+      </w:pPr>
+    </w:p>
+    <w:p>
+      <w:pPr>
+        <w:rPr>
+          <w:rFonts w:ascii="Didot" w:hAnsi="Didot" w:cs="Didot"/>
+        </w:rPr>
+      </w:pPr>
+    </w:p>
+    <w:p>
+      <w:pPr>
+        <w:rPr>
+          <w:rFonts w:ascii="Didot" w:hAnsi="Didot" w:cs="Didot"/>
+        </w:rPr>
+      </w:pPr>
+    </w:p>
+    <w:p>
+      <w:pPr>
+        <w:rPr>
+          <w:rFonts w:ascii="Didot" w:hAnsi="Didot" w:cs="Didot"/>
+        </w:rPr>
+      </w:pPr>
+    </w:p>
+    <w:p>
+      <w:pPr>
+        <w:rPr>
+          <w:rFonts w:ascii="Didot" w:hAnsi="Didot" w:cs="Didot"/>
+        </w:rPr>
+      </w:pPr>
+    </w:p>
+    <w:p>
+      <w:pPr>
+        <w:rPr>
+          <w:rFonts w:ascii="Didot" w:hAnsi="Didot" w:cs="Didot"/>
+        </w:rPr>
+      </w:pPr>
+    </w:p>
+    <w:p>
+      <w:pPr>
+        <w:rPr>
+          <w:rFonts w:ascii="Didot" w:hAnsi="Didot" w:cs="Didot"/>
+        </w:rPr>
+      </w:pPr>
+    </w:p>
     <w:p>
       <w:pPr>
         <w:jc w:val="center"/>
         <w:rPr>
-          <w:rFonts w:ascii="Didot" w:hAnsi="Didot" w:cs="Didot" w:hint="cs"/>
-          <w:sz w:val="40"/>
-          <w:szCs w:val="40"/>
+          <w:rFonts w:ascii="Didot" w:hAnsi="Didot" w:cs="Didot"/>
         </w:rPr>
       </w:pPr>
       <w:r>
         <w:rPr>
-          <w:rFonts w:ascii="Didot" w:hAnsi="Didot" w:cs="Didot" w:hint="cs"/>
-          <w:sz w:val="40"/>
-          <w:szCs w:val="40"/>
-        </w:rPr>
-        <w:t>UFV - Universidade Federal de Viçosa</w:t>
+          <w:rFonts w:ascii="Didot" w:hAnsi="Didot" w:cs="Didot"/>
+        </w:rPr>
+        <w:t>Projeto Final</w:t>
       </w:r>
     </w:p>
     <w:p>
       <w:pPr>
         <w:rPr>
-          <w:rFonts w:ascii="Didot" w:hAnsi="Didot" w:cs="Didot" w:hint="cs"/>
-        </w:rPr>
-      </w:pPr>
-    </w:p>
-    <w:p>
-      <w:pPr>
-        <w:rPr>
-          <w:rFonts w:ascii="Didot" w:hAnsi="Didot" w:cs="Didot" w:hint="cs"/>
-        </w:rPr>
-      </w:pPr>
-    </w:p>
-    <w:p>
-      <w:pPr>
-        <w:rPr>
-          <w:rFonts w:ascii="Didot" w:hAnsi="Didot" w:cs="Didot" w:hint="cs"/>
-        </w:rPr>
-      </w:pPr>
-    </w:p>
-    <w:p>
-      <w:pPr>
-        <w:rPr>
-          <w:rFonts w:ascii="Didot" w:hAnsi="Didot" w:cs="Didot" w:hint="cs"/>
-        </w:rPr>
-      </w:pPr>
-    </w:p>
-    <w:p>
-      <w:pPr>
-        <w:rPr>
-          <w:rFonts w:ascii="Didot" w:hAnsi="Didot" w:cs="Didot" w:hint="cs"/>
-        </w:rPr>
-      </w:pPr>
-    </w:p>
-    <w:p>
-      <w:pPr>
-        <w:rPr>
-          <w:rFonts w:ascii="Didot" w:hAnsi="Didot" w:cs="Didot" w:hint="cs"/>
-        </w:rPr>
-      </w:pPr>
-    </w:p>
-    <w:p>
-      <w:pPr>
-        <w:rPr>
-          <w:rFonts w:ascii="Didot" w:hAnsi="Didot" w:cs="Didot" w:hint="cs"/>
-        </w:rPr>
-      </w:pPr>
-    </w:p>
-    <w:p>
-      <w:pPr>
-        <w:rPr>
-          <w:rFonts w:ascii="Didot" w:hAnsi="Didot" w:cs="Didot" w:hint="cs"/>
-        </w:rPr>
-      </w:pPr>
-    </w:p>
-    <w:p>
-      <w:pPr>
-        <w:rPr>
-          <w:rFonts w:ascii="Didot" w:hAnsi="Didot" w:cs="Didot" w:hint="cs"/>
-        </w:rPr>
-      </w:pPr>
-    </w:p>
-    <w:p>
-      <w:pPr>
-        <w:rPr>
-          <w:rFonts w:ascii="Didot" w:hAnsi="Didot" w:cs="Didot" w:hint="cs"/>
-        </w:rPr>
-      </w:pPr>
-    </w:p>
-    <w:p>
-      <w:pPr>
-        <w:rPr>
-          <w:rFonts w:ascii="Didot" w:hAnsi="Didot" w:cs="Didot" w:hint="cs"/>
+          <w:rFonts w:ascii="Didot" w:hAnsi="Didot" w:cs="Didot"/>
+        </w:rPr>
+      </w:pPr>
+    </w:p>
+    <w:p>
+      <w:pPr>
+        <w:rPr>
+          <w:rFonts w:ascii="Didot" w:hAnsi="Didot" w:cs="Didot"/>
+        </w:rPr>
+      </w:pPr>
+    </w:p>
+    <w:p>
+      <w:pPr>
+        <w:rPr>
+          <w:rFonts w:ascii="Didot" w:hAnsi="Didot" w:cs="Didot"/>
+        </w:rPr>
+      </w:pPr>
+    </w:p>
+    <w:p>
+      <w:pPr>
+        <w:rPr>
+          <w:rFonts w:ascii="Didot" w:hAnsi="Didot" w:cs="Didot"/>
+          <w:lang w:val="en-US"/>
+        </w:rPr>
+      </w:pPr>
+    </w:p>
+    <w:p>
+      <w:pPr>
+        <w:rPr>
+          <w:rFonts w:ascii="Didot" w:hAnsi="Didot" w:cs="Didot"/>
+        </w:rPr>
+      </w:pPr>
+    </w:p>
+    <w:p>
+      <w:pPr>
+        <w:rPr>
+          <w:rFonts w:ascii="Didot" w:hAnsi="Didot" w:cs="Didot"/>
+        </w:rPr>
+      </w:pPr>
+    </w:p>
+    <w:p>
+      <w:pPr>
+        <w:rPr>
+          <w:rFonts w:ascii="Didot" w:hAnsi="Didot" w:cs="Didot"/>
         </w:rPr>
       </w:pPr>
     </w:p>
@@ -101,97 +304,7 @@
       <w:pPr>
         <w:jc w:val="center"/>
         <w:rPr>
-          <w:rFonts w:ascii="Didot" w:hAnsi="Didot" w:cs="Didot" w:hint="cs"/>
-        </w:rPr>
-      </w:pPr>
-      <w:r>
-        <w:rPr>
-          <w:rFonts w:ascii="Didot" w:hAnsi="Didot" w:cs="Didot" w:hint="cs"/>
-        </w:rPr>
-        <w:t xml:space="preserve">Cintia </w:t>
-      </w:r>
-      <w:proofErr w:type="spellStart"/>
-      <w:r>
-        <w:rPr>
-          <w:rFonts w:ascii="Didot" w:hAnsi="Didot" w:cs="Didot" w:hint="cs"/>
-        </w:rPr>
-        <w:t>Izumi</w:t>
-      </w:r>
-      <w:proofErr w:type="spellEnd"/>
-      <w:r>
-        <w:rPr>
-          <w:rFonts w:ascii="Didot" w:hAnsi="Didot" w:cs="Didot" w:hint="cs"/>
-        </w:rPr>
-        <w:t xml:space="preserve"> Shinoda</w:t>
-      </w:r>
-    </w:p>
-    <w:p>
-      <w:pPr>
-        <w:rPr>
-          <w:rFonts w:ascii="Didot" w:hAnsi="Didot" w:cs="Didot" w:hint="cs"/>
-        </w:rPr>
-      </w:pPr>
-    </w:p>
-    <w:p>
-      <w:pPr>
-        <w:rPr>
-          <w:rFonts w:ascii="Didot" w:hAnsi="Didot" w:cs="Didot" w:hint="cs"/>
-        </w:rPr>
-      </w:pPr>
-    </w:p>
-    <w:p>
-      <w:pPr>
-        <w:rPr>
-          <w:rFonts w:ascii="Didot" w:hAnsi="Didot" w:cs="Didot" w:hint="cs"/>
-        </w:rPr>
-      </w:pPr>
-    </w:p>
-    <w:p>
-      <w:pPr>
-        <w:rPr>
-          <w:rFonts w:ascii="Didot" w:hAnsi="Didot" w:cs="Didot" w:hint="cs"/>
-        </w:rPr>
-      </w:pPr>
-    </w:p>
-    <w:p>
-      <w:pPr>
-        <w:rPr>
-          <w:rFonts w:ascii="Didot" w:hAnsi="Didot" w:cs="Didot" w:hint="cs"/>
-        </w:rPr>
-      </w:pPr>
-    </w:p>
-    <w:p>
-      <w:pPr>
-        <w:rPr>
-          <w:rFonts w:ascii="Didot" w:hAnsi="Didot" w:cs="Didot" w:hint="cs"/>
-        </w:rPr>
-      </w:pPr>
-    </w:p>
-    <w:p>
-      <w:pPr>
-        <w:rPr>
-          <w:rFonts w:ascii="Didot" w:hAnsi="Didot" w:cs="Didot" w:hint="cs"/>
-        </w:rPr>
-      </w:pPr>
-    </w:p>
-    <w:p>
-      <w:pPr>
-        <w:rPr>
-          <w:rFonts w:ascii="Didot" w:hAnsi="Didot" w:cs="Didot" w:hint="cs"/>
-        </w:rPr>
-      </w:pPr>
-    </w:p>
-    <w:p>
-      <w:pPr>
-        <w:rPr>
-          <w:rFonts w:ascii="Didot" w:hAnsi="Didot" w:cs="Didot" w:hint="cs"/>
-        </w:rPr>
-      </w:pPr>
-    </w:p>
-    <w:p>
-      <w:pPr>
-        <w:rPr>
-          <w:rFonts w:ascii="Didot" w:hAnsi="Didot" w:cs="Didot" w:hint="cs"/>
+          <w:rFonts w:ascii="Didot" w:hAnsi="Didot" w:cs="Didot"/>
         </w:rPr>
       </w:pPr>
     </w:p>
@@ -215,7 +328,31 @@
       <w:pPr>
         <w:jc w:val="center"/>
         <w:rPr>
-          <w:rFonts w:ascii="Didot" w:hAnsi="Didot" w:cs="Didot" w:hint="cs"/>
+          <w:rFonts w:ascii="Didot" w:hAnsi="Didot" w:cs="Didot"/>
+        </w:rPr>
+      </w:pPr>
+    </w:p>
+    <w:p>
+      <w:pPr>
+        <w:jc w:val="center"/>
+        <w:rPr>
+          <w:rFonts w:ascii="Didot" w:hAnsi="Didot" w:cs="Didot"/>
+        </w:rPr>
+      </w:pPr>
+    </w:p>
+    <w:p>
+      <w:pPr>
+        <w:jc w:val="center"/>
+        <w:rPr>
+          <w:rFonts w:ascii="Didot" w:hAnsi="Didot" w:cs="Didot"/>
+        </w:rPr>
+      </w:pPr>
+    </w:p>
+    <w:p>
+      <w:pPr>
+        <w:jc w:val="center"/>
+        <w:rPr>
+          <w:rFonts w:ascii="Didot" w:hAnsi="Didot" w:cs="Didot"/>
         </w:rPr>
       </w:pPr>
       <w:r>
@@ -227,603 +364,805 @@
     </w:p>
     <w:p>
       <w:pPr>
-        <w:rPr>
-          <w:rFonts w:ascii="Didot" w:hAnsi="Didot" w:cs="Didot" w:hint="cs"/>
-        </w:rPr>
+        <w:pStyle w:val="Heading1"/>
       </w:pPr>
       <w:r>
-        <w:rPr>
-          <w:rFonts w:ascii="Didot" w:hAnsi="Didot" w:cs="Didot" w:hint="cs"/>
-        </w:rPr>
         <w:lastRenderedPageBreak/>
+        <w:t xml:space="preserve">1 </w:t>
+      </w:r>
+      <w:r>
+        <w:rPr>
+          <w:rFonts w:hint="cs"/>
+        </w:rPr>
         <w:t>Descrição do Protótipo</w:t>
       </w:r>
     </w:p>
     <w:p>
       <w:pPr>
-        <w:rPr>
-          <w:rFonts w:ascii="Didot" w:hAnsi="Didot" w:cs="Didot" w:hint="cs"/>
-        </w:rPr>
-      </w:pPr>
-    </w:p>
-    <w:p>
-      <w:pPr>
-        <w:rPr>
-          <w:rFonts w:ascii="Didot" w:hAnsi="Didot" w:cs="Didot" w:hint="cs"/>
-        </w:rPr>
-      </w:pPr>
-    </w:p>
-    <w:p>
-      <w:pPr>
-        <w:rPr>
-          <w:rFonts w:ascii="Didot" w:hAnsi="Didot" w:cs="Didot" w:hint="cs"/>
-        </w:rPr>
-      </w:pPr>
-    </w:p>
-    <w:p>
-      <w:pPr>
-        <w:rPr>
-          <w:rFonts w:ascii="Didot" w:hAnsi="Didot" w:cs="Didot" w:hint="cs"/>
-        </w:rPr>
-      </w:pPr>
-    </w:p>
-    <w:p>
-      <w:pPr>
-        <w:rPr>
-          <w:rFonts w:ascii="Didot" w:hAnsi="Didot" w:cs="Didot" w:hint="cs"/>
-        </w:rPr>
-      </w:pPr>
-    </w:p>
-    <w:p>
-      <w:pPr>
-        <w:rPr>
-          <w:rFonts w:ascii="Didot" w:hAnsi="Didot" w:cs="Didot" w:hint="cs"/>
-        </w:rPr>
-      </w:pPr>
-    </w:p>
-    <w:p>
-      <w:pPr>
-        <w:rPr>
-          <w:rFonts w:ascii="Didot" w:hAnsi="Didot" w:cs="Didot" w:hint="cs"/>
-        </w:rPr>
-      </w:pPr>
-    </w:p>
-    <w:p>
-      <w:pPr>
-        <w:rPr>
-          <w:rFonts w:ascii="Didot" w:hAnsi="Didot" w:cs="Didot" w:hint="cs"/>
-        </w:rPr>
-      </w:pPr>
-    </w:p>
-    <w:p>
-      <w:pPr>
-        <w:rPr>
-          <w:rFonts w:ascii="Didot" w:hAnsi="Didot" w:cs="Didot" w:hint="cs"/>
-        </w:rPr>
-      </w:pPr>
-    </w:p>
-    <w:p>
-      <w:pPr>
-        <w:rPr>
-          <w:rFonts w:ascii="Didot" w:hAnsi="Didot" w:cs="Didot" w:hint="cs"/>
-        </w:rPr>
-      </w:pPr>
-    </w:p>
-    <w:p>
-      <w:pPr>
-        <w:rPr>
-          <w:rFonts w:ascii="Didot" w:hAnsi="Didot" w:cs="Didot" w:hint="cs"/>
-        </w:rPr>
-      </w:pPr>
-    </w:p>
-    <w:p>
-      <w:pPr>
-        <w:rPr>
-          <w:rFonts w:ascii="Didot" w:hAnsi="Didot" w:cs="Didot" w:hint="cs"/>
-        </w:rPr>
-      </w:pPr>
-    </w:p>
-    <w:p>
-      <w:pPr>
-        <w:rPr>
-          <w:rFonts w:ascii="Didot" w:hAnsi="Didot" w:cs="Didot" w:hint="cs"/>
-        </w:rPr>
-      </w:pPr>
-    </w:p>
-    <w:p>
-      <w:pPr>
-        <w:rPr>
-          <w:rFonts w:ascii="Didot" w:hAnsi="Didot" w:cs="Didot" w:hint="cs"/>
-        </w:rPr>
-      </w:pPr>
-    </w:p>
-    <w:p>
-      <w:pPr>
-        <w:rPr>
-          <w:rFonts w:ascii="Didot" w:hAnsi="Didot" w:cs="Didot" w:hint="cs"/>
-        </w:rPr>
-      </w:pPr>
-    </w:p>
-    <w:p>
-      <w:pPr>
-        <w:rPr>
-          <w:rFonts w:ascii="Didot" w:hAnsi="Didot" w:cs="Didot" w:hint="cs"/>
-        </w:rPr>
-      </w:pPr>
-    </w:p>
-    <w:p>
-      <w:pPr>
-        <w:rPr>
-          <w:rFonts w:ascii="Didot" w:hAnsi="Didot" w:cs="Didot" w:hint="cs"/>
-        </w:rPr>
-      </w:pPr>
-    </w:p>
-    <w:p>
-      <w:pPr>
-        <w:rPr>
-          <w:rFonts w:ascii="Didot" w:hAnsi="Didot" w:cs="Didot" w:hint="cs"/>
-        </w:rPr>
-      </w:pPr>
-    </w:p>
-    <w:p>
-      <w:pPr>
-        <w:rPr>
-          <w:rFonts w:ascii="Didot" w:hAnsi="Didot" w:cs="Didot" w:hint="cs"/>
-        </w:rPr>
-      </w:pPr>
-    </w:p>
-    <w:p>
-      <w:pPr>
-        <w:rPr>
-          <w:rFonts w:ascii="Didot" w:hAnsi="Didot" w:cs="Didot" w:hint="cs"/>
-        </w:rPr>
-      </w:pPr>
-    </w:p>
-    <w:p>
-      <w:pPr>
-        <w:rPr>
-          <w:rFonts w:ascii="Didot" w:hAnsi="Didot" w:cs="Didot" w:hint="cs"/>
-        </w:rPr>
-      </w:pPr>
-    </w:p>
-    <w:p>
-      <w:pPr>
-        <w:rPr>
-          <w:rFonts w:ascii="Didot" w:hAnsi="Didot" w:cs="Didot" w:hint="cs"/>
-        </w:rPr>
-      </w:pPr>
-    </w:p>
-    <w:p>
-      <w:pPr>
-        <w:rPr>
-          <w:rFonts w:ascii="Didot" w:hAnsi="Didot" w:cs="Didot" w:hint="cs"/>
-        </w:rPr>
-      </w:pPr>
-    </w:p>
-    <w:p>
-      <w:pPr>
-        <w:rPr>
-          <w:rFonts w:ascii="Didot" w:hAnsi="Didot" w:cs="Didot" w:hint="cs"/>
-        </w:rPr>
-      </w:pPr>
-    </w:p>
-    <w:p>
-      <w:pPr>
-        <w:rPr>
-          <w:rFonts w:ascii="Didot" w:hAnsi="Didot" w:cs="Didot"/>
-        </w:rPr>
-      </w:pPr>
-    </w:p>
-    <w:p>
-      <w:pPr>
-        <w:rPr>
-          <w:rFonts w:ascii="Didot" w:hAnsi="Didot" w:cs="Didot" w:hint="cs"/>
-        </w:rPr>
-      </w:pPr>
-    </w:p>
-    <w:p>
-      <w:pPr>
-        <w:rPr>
-          <w:rFonts w:ascii="Didot" w:hAnsi="Didot" w:cs="Didot" w:hint="cs"/>
-        </w:rPr>
+        <w:pStyle w:val="Heading2"/>
       </w:pPr>
       <w:r>
-        <w:rPr>
-          <w:rFonts w:ascii="Didot" w:hAnsi="Didot" w:cs="Didot" w:hint="cs"/>
-        </w:rPr>
+        <w:t>1.1 Objetivo</w:t>
+      </w:r>
+    </w:p>
+    <w:p>
+      <w:pPr>
+        <w:rPr>
+          <w:rFonts w:ascii="Didot" w:hAnsi="Didot" w:cs="Didot"/>
+        </w:rPr>
+      </w:pPr>
+    </w:p>
+    <w:p>
+      <w:pPr>
+        <w:pStyle w:val="Heading2"/>
+      </w:pPr>
+      <w:r>
+        <w:t>1.2 Contexto de Aplicação</w:t>
+      </w:r>
+    </w:p>
+    <w:p>
+      <w:pPr>
+        <w:rPr>
+          <w:rFonts w:ascii="Didot" w:hAnsi="Didot" w:cs="Didot"/>
+        </w:rPr>
+      </w:pPr>
+    </w:p>
+    <w:p>
+      <w:pPr>
+        <w:rPr>
+          <w:rFonts w:ascii="Didot" w:hAnsi="Didot" w:cs="Didot"/>
+        </w:rPr>
+      </w:pPr>
+    </w:p>
+    <w:p>
+      <w:pPr>
+        <w:rPr>
+          <w:rFonts w:ascii="Didot" w:hAnsi="Didot" w:cs="Didot"/>
+        </w:rPr>
+      </w:pPr>
+    </w:p>
+    <w:p>
+      <w:pPr>
+        <w:rPr>
+          <w:rFonts w:ascii="Didot" w:hAnsi="Didot" w:cs="Didot"/>
+        </w:rPr>
+      </w:pPr>
+    </w:p>
+    <w:p>
+      <w:pPr>
+        <w:rPr>
+          <w:rFonts w:ascii="Didot" w:hAnsi="Didot" w:cs="Didot"/>
+        </w:rPr>
+      </w:pPr>
+    </w:p>
+    <w:p>
+      <w:pPr>
+        <w:rPr>
+          <w:rFonts w:ascii="Didot" w:hAnsi="Didot" w:cs="Didot"/>
+        </w:rPr>
+      </w:pPr>
+    </w:p>
+    <w:p>
+      <w:pPr>
+        <w:rPr>
+          <w:rFonts w:ascii="Didot" w:hAnsi="Didot" w:cs="Didot"/>
+        </w:rPr>
+      </w:pPr>
+    </w:p>
+    <w:p>
+      <w:pPr>
+        <w:rPr>
+          <w:rFonts w:ascii="Didot" w:hAnsi="Didot" w:cs="Didot"/>
+        </w:rPr>
+      </w:pPr>
+    </w:p>
+    <w:p>
+      <w:pPr>
+        <w:rPr>
+          <w:rFonts w:ascii="Didot" w:hAnsi="Didot" w:cs="Didot"/>
+        </w:rPr>
+      </w:pPr>
+    </w:p>
+    <w:p>
+      <w:pPr>
+        <w:rPr>
+          <w:rFonts w:ascii="Didot" w:hAnsi="Didot" w:cs="Didot"/>
+        </w:rPr>
+      </w:pPr>
+    </w:p>
+    <w:p>
+      <w:pPr>
+        <w:rPr>
+          <w:rFonts w:ascii="Didot" w:hAnsi="Didot" w:cs="Didot"/>
+        </w:rPr>
+      </w:pPr>
+    </w:p>
+    <w:p>
+      <w:pPr>
+        <w:rPr>
+          <w:rFonts w:ascii="Didot" w:hAnsi="Didot" w:cs="Didot"/>
+        </w:rPr>
+      </w:pPr>
+    </w:p>
+    <w:p>
+      <w:pPr>
+        <w:rPr>
+          <w:rFonts w:ascii="Didot" w:hAnsi="Didot" w:cs="Didot"/>
+        </w:rPr>
+      </w:pPr>
+    </w:p>
+    <w:p>
+      <w:pPr>
+        <w:rPr>
+          <w:rFonts w:ascii="Didot" w:hAnsi="Didot" w:cs="Didot"/>
+        </w:rPr>
+      </w:pPr>
+    </w:p>
+    <w:p>
+      <w:pPr>
+        <w:rPr>
+          <w:rFonts w:ascii="Didot" w:hAnsi="Didot" w:cs="Didot"/>
+        </w:rPr>
+      </w:pPr>
+    </w:p>
+    <w:p>
+      <w:pPr>
+        <w:rPr>
+          <w:rFonts w:ascii="Didot" w:hAnsi="Didot" w:cs="Didot"/>
+        </w:rPr>
+      </w:pPr>
+    </w:p>
+    <w:p>
+      <w:pPr>
+        <w:rPr>
+          <w:rFonts w:ascii="Didot" w:hAnsi="Didot" w:cs="Didot"/>
+        </w:rPr>
+      </w:pPr>
+    </w:p>
+    <w:p>
+      <w:pPr>
+        <w:rPr>
+          <w:rFonts w:ascii="Didot" w:hAnsi="Didot" w:cs="Didot"/>
+        </w:rPr>
+      </w:pPr>
+    </w:p>
+    <w:p>
+      <w:pPr>
+        <w:rPr>
+          <w:rFonts w:ascii="Didot" w:hAnsi="Didot" w:cs="Didot"/>
+        </w:rPr>
+      </w:pPr>
+    </w:p>
+    <w:p>
+      <w:pPr>
+        <w:rPr>
+          <w:rFonts w:ascii="Didot" w:hAnsi="Didot" w:cs="Didot"/>
+        </w:rPr>
+      </w:pPr>
+    </w:p>
+    <w:p>
+      <w:pPr>
+        <w:rPr>
+          <w:rFonts w:ascii="Didot" w:hAnsi="Didot" w:cs="Didot"/>
+        </w:rPr>
+      </w:pPr>
+    </w:p>
+    <w:p>
+      <w:pPr>
+        <w:rPr>
+          <w:rFonts w:ascii="Didot" w:hAnsi="Didot" w:cs="Didot"/>
+        </w:rPr>
+      </w:pPr>
+    </w:p>
+    <w:p>
+      <w:pPr>
+        <w:rPr>
+          <w:rFonts w:ascii="Didot" w:hAnsi="Didot" w:cs="Didot"/>
+        </w:rPr>
+      </w:pPr>
+    </w:p>
+    <w:p>
+      <w:pPr>
+        <w:pStyle w:val="Heading1"/>
+      </w:pPr>
+      <w:r>
         <w:lastRenderedPageBreak/>
+        <w:t xml:space="preserve">2 </w:t>
+      </w:r>
+      <w:r>
+        <w:rPr>
+          <w:rFonts w:hint="cs"/>
+        </w:rPr>
         <w:t>Parte Mecânica</w:t>
       </w:r>
     </w:p>
     <w:p>
       <w:pPr>
-        <w:rPr>
-          <w:rFonts w:ascii="Didot" w:hAnsi="Didot" w:cs="Didot" w:hint="cs"/>
-        </w:rPr>
-      </w:pPr>
-    </w:p>
-    <w:p>
-      <w:pPr>
-        <w:rPr>
-          <w:rFonts w:ascii="Didot" w:hAnsi="Didot" w:cs="Didot" w:hint="cs"/>
-        </w:rPr>
-      </w:pPr>
-    </w:p>
-    <w:p>
-      <w:pPr>
-        <w:rPr>
-          <w:rFonts w:ascii="Didot" w:hAnsi="Didot" w:cs="Didot" w:hint="cs"/>
-        </w:rPr>
-      </w:pPr>
-    </w:p>
-    <w:p>
-      <w:pPr>
-        <w:rPr>
-          <w:rFonts w:ascii="Didot" w:hAnsi="Didot" w:cs="Didot" w:hint="cs"/>
-        </w:rPr>
-      </w:pPr>
-    </w:p>
-    <w:p>
-      <w:pPr>
-        <w:rPr>
-          <w:rFonts w:ascii="Didot" w:hAnsi="Didot" w:cs="Didot" w:hint="cs"/>
-        </w:rPr>
-      </w:pPr>
-    </w:p>
-    <w:p>
-      <w:pPr>
-        <w:rPr>
-          <w:rFonts w:ascii="Didot" w:hAnsi="Didot" w:cs="Didot" w:hint="cs"/>
-        </w:rPr>
-      </w:pPr>
-    </w:p>
-    <w:p>
-      <w:pPr>
-        <w:rPr>
-          <w:rFonts w:ascii="Didot" w:hAnsi="Didot" w:cs="Didot" w:hint="cs"/>
-        </w:rPr>
-      </w:pPr>
-    </w:p>
-    <w:p>
-      <w:pPr>
-        <w:rPr>
-          <w:rFonts w:ascii="Didot" w:hAnsi="Didot" w:cs="Didot" w:hint="cs"/>
-        </w:rPr>
-      </w:pPr>
-    </w:p>
-    <w:p>
-      <w:pPr>
-        <w:rPr>
-          <w:rFonts w:ascii="Didot" w:hAnsi="Didot" w:cs="Didot" w:hint="cs"/>
-        </w:rPr>
-      </w:pPr>
-    </w:p>
-    <w:p>
-      <w:pPr>
-        <w:rPr>
-          <w:rFonts w:ascii="Didot" w:hAnsi="Didot" w:cs="Didot" w:hint="cs"/>
-        </w:rPr>
-      </w:pPr>
-    </w:p>
-    <w:p>
-      <w:pPr>
-        <w:rPr>
-          <w:rFonts w:ascii="Didot" w:hAnsi="Didot" w:cs="Didot" w:hint="cs"/>
-        </w:rPr>
-      </w:pPr>
-    </w:p>
-    <w:p>
-      <w:pPr>
-        <w:rPr>
-          <w:rFonts w:ascii="Didot" w:hAnsi="Didot" w:cs="Didot" w:hint="cs"/>
-        </w:rPr>
-      </w:pPr>
-    </w:p>
-    <w:p>
-      <w:pPr>
-        <w:rPr>
-          <w:rFonts w:ascii="Didot" w:hAnsi="Didot" w:cs="Didot" w:hint="cs"/>
-        </w:rPr>
-      </w:pPr>
-    </w:p>
-    <w:p>
-      <w:pPr>
-        <w:rPr>
-          <w:rFonts w:ascii="Didot" w:hAnsi="Didot" w:cs="Didot" w:hint="cs"/>
-        </w:rPr>
-      </w:pPr>
-    </w:p>
-    <w:p>
-      <w:pPr>
-        <w:rPr>
-          <w:rFonts w:ascii="Didot" w:hAnsi="Didot" w:cs="Didot" w:hint="cs"/>
-        </w:rPr>
-      </w:pPr>
-    </w:p>
-    <w:p>
-      <w:pPr>
-        <w:rPr>
-          <w:rFonts w:ascii="Didot" w:hAnsi="Didot" w:cs="Didot" w:hint="cs"/>
-        </w:rPr>
-      </w:pPr>
-    </w:p>
-    <w:p>
-      <w:pPr>
-        <w:rPr>
-          <w:rFonts w:ascii="Didot" w:hAnsi="Didot" w:cs="Didot" w:hint="cs"/>
-        </w:rPr>
-      </w:pPr>
-    </w:p>
-    <w:p>
-      <w:pPr>
-        <w:rPr>
-          <w:rFonts w:ascii="Didot" w:hAnsi="Didot" w:cs="Didot" w:hint="cs"/>
-        </w:rPr>
-      </w:pPr>
-    </w:p>
-    <w:p>
-      <w:pPr>
-        <w:rPr>
-          <w:rFonts w:ascii="Didot" w:hAnsi="Didot" w:cs="Didot" w:hint="cs"/>
-        </w:rPr>
-      </w:pPr>
-    </w:p>
-    <w:p>
-      <w:pPr>
-        <w:rPr>
-          <w:rFonts w:ascii="Didot" w:hAnsi="Didot" w:cs="Didot" w:hint="cs"/>
-        </w:rPr>
-      </w:pPr>
-    </w:p>
-    <w:p>
-      <w:pPr>
-        <w:rPr>
-          <w:rFonts w:ascii="Didot" w:hAnsi="Didot" w:cs="Didot" w:hint="cs"/>
-        </w:rPr>
-      </w:pPr>
-    </w:p>
-    <w:p>
-      <w:pPr>
-        <w:rPr>
-          <w:rFonts w:ascii="Didot" w:hAnsi="Didot" w:cs="Didot" w:hint="cs"/>
-        </w:rPr>
-      </w:pPr>
-    </w:p>
-    <w:p>
-      <w:pPr>
-        <w:rPr>
-          <w:rFonts w:ascii="Didot" w:hAnsi="Didot" w:cs="Didot" w:hint="cs"/>
-        </w:rPr>
-      </w:pPr>
-    </w:p>
-    <w:p>
-      <w:pPr>
-        <w:rPr>
-          <w:rFonts w:ascii="Didot" w:hAnsi="Didot" w:cs="Didot" w:hint="cs"/>
-        </w:rPr>
-      </w:pPr>
-    </w:p>
-    <w:p>
-      <w:pPr>
-        <w:rPr>
-          <w:rFonts w:ascii="Didot" w:hAnsi="Didot" w:cs="Didot"/>
-        </w:rPr>
-      </w:pPr>
-    </w:p>
-    <w:p>
-      <w:pPr>
-        <w:rPr>
-          <w:rFonts w:ascii="Didot" w:hAnsi="Didot" w:cs="Didot" w:hint="cs"/>
-        </w:rPr>
-      </w:pPr>
-    </w:p>
-    <w:p>
-      <w:pPr>
-        <w:rPr>
-          <w:rFonts w:ascii="Didot" w:hAnsi="Didot" w:cs="Didot" w:hint="cs"/>
-        </w:rPr>
+        <w:pStyle w:val="Heading2"/>
       </w:pPr>
       <w:r>
-        <w:rPr>
-          <w:rFonts w:ascii="Didot" w:hAnsi="Didot" w:cs="Didot" w:hint="cs"/>
-        </w:rPr>
+        <w:t xml:space="preserve">2.1 </w:t>
+      </w:r>
+    </w:p>
+    <w:p>
+      <w:pPr>
+        <w:rPr>
+          <w:rFonts w:ascii="Didot" w:hAnsi="Didot" w:cs="Didot"/>
+        </w:rPr>
+      </w:pPr>
+    </w:p>
+    <w:p>
+      <w:pPr>
+        <w:pStyle w:val="Heading2"/>
+      </w:pPr>
+      <w:r>
+        <w:t>2.2 Justificativa do Material</w:t>
+      </w:r>
+    </w:p>
+    <w:p>
+      <w:pPr>
+        <w:rPr>
+          <w:rFonts w:ascii="Didot" w:hAnsi="Didot" w:cs="Didot"/>
+        </w:rPr>
+      </w:pPr>
+    </w:p>
+    <w:p>
+      <w:pPr>
+        <w:pStyle w:val="Heading2"/>
+      </w:pPr>
+      <w:r>
+        <w:t>2.3 Processo de Fabricação Escolhidos</w:t>
+      </w:r>
+    </w:p>
+    <w:p>
+      <w:pPr>
+        <w:rPr>
+          <w:rFonts w:ascii="Didot" w:hAnsi="Didot" w:cs="Didot"/>
+        </w:rPr>
+      </w:pPr>
+    </w:p>
+    <w:p>
+      <w:pPr>
+        <w:rPr>
+          <w:rFonts w:ascii="Didot" w:hAnsi="Didot" w:cs="Didot"/>
+        </w:rPr>
+      </w:pPr>
+    </w:p>
+    <w:p>
+      <w:pPr>
+        <w:rPr>
+          <w:rFonts w:ascii="Didot" w:hAnsi="Didot" w:cs="Didot"/>
+        </w:rPr>
+      </w:pPr>
+    </w:p>
+    <w:p>
+      <w:pPr>
+        <w:rPr>
+          <w:rFonts w:ascii="Didot" w:hAnsi="Didot" w:cs="Didot"/>
+        </w:rPr>
+      </w:pPr>
+    </w:p>
+    <w:p>
+      <w:pPr>
+        <w:rPr>
+          <w:rFonts w:ascii="Didot" w:hAnsi="Didot" w:cs="Didot"/>
+        </w:rPr>
+      </w:pPr>
+    </w:p>
+    <w:p>
+      <w:pPr>
+        <w:rPr>
+          <w:rFonts w:ascii="Didot" w:hAnsi="Didot" w:cs="Didot"/>
+        </w:rPr>
+      </w:pPr>
+    </w:p>
+    <w:p>
+      <w:pPr>
+        <w:rPr>
+          <w:rFonts w:ascii="Didot" w:hAnsi="Didot" w:cs="Didot"/>
+        </w:rPr>
+      </w:pPr>
+    </w:p>
+    <w:p>
+      <w:pPr>
+        <w:rPr>
+          <w:rFonts w:ascii="Didot" w:hAnsi="Didot" w:cs="Didot"/>
+        </w:rPr>
+      </w:pPr>
+    </w:p>
+    <w:p>
+      <w:pPr>
+        <w:rPr>
+          <w:rFonts w:ascii="Didot" w:hAnsi="Didot" w:cs="Didot"/>
+        </w:rPr>
+      </w:pPr>
+    </w:p>
+    <w:p>
+      <w:pPr>
+        <w:rPr>
+          <w:rFonts w:ascii="Didot" w:hAnsi="Didot" w:cs="Didot"/>
+        </w:rPr>
+      </w:pPr>
+    </w:p>
+    <w:p>
+      <w:pPr>
+        <w:rPr>
+          <w:rFonts w:ascii="Didot" w:hAnsi="Didot" w:cs="Didot"/>
+        </w:rPr>
+      </w:pPr>
+    </w:p>
+    <w:p>
+      <w:pPr>
+        <w:rPr>
+          <w:rFonts w:ascii="Didot" w:hAnsi="Didot" w:cs="Didot"/>
+        </w:rPr>
+      </w:pPr>
+    </w:p>
+    <w:p>
+      <w:pPr>
+        <w:rPr>
+          <w:rFonts w:ascii="Didot" w:hAnsi="Didot" w:cs="Didot"/>
+        </w:rPr>
+      </w:pPr>
+    </w:p>
+    <w:p>
+      <w:pPr>
+        <w:rPr>
+          <w:rFonts w:ascii="Didot" w:hAnsi="Didot" w:cs="Didot"/>
+        </w:rPr>
+      </w:pPr>
+    </w:p>
+    <w:p>
+      <w:pPr>
+        <w:rPr>
+          <w:rFonts w:ascii="Didot" w:hAnsi="Didot" w:cs="Didot"/>
+        </w:rPr>
+      </w:pPr>
+    </w:p>
+    <w:p>
+      <w:pPr>
+        <w:rPr>
+          <w:rFonts w:ascii="Didot" w:hAnsi="Didot" w:cs="Didot"/>
+        </w:rPr>
+      </w:pPr>
+    </w:p>
+    <w:p>
+      <w:pPr>
+        <w:rPr>
+          <w:rFonts w:ascii="Didot" w:hAnsi="Didot" w:cs="Didot"/>
+        </w:rPr>
+      </w:pPr>
+    </w:p>
+    <w:p>
+      <w:pPr>
+        <w:rPr>
+          <w:rFonts w:ascii="Didot" w:hAnsi="Didot" w:cs="Didot"/>
+        </w:rPr>
+      </w:pPr>
+    </w:p>
+    <w:p>
+      <w:pPr>
+        <w:rPr>
+          <w:rFonts w:ascii="Didot" w:hAnsi="Didot" w:cs="Didot"/>
+        </w:rPr>
+      </w:pPr>
+    </w:p>
+    <w:p>
+      <w:pPr>
+        <w:rPr>
+          <w:rFonts w:ascii="Didot" w:hAnsi="Didot" w:cs="Didot"/>
+        </w:rPr>
+      </w:pPr>
+    </w:p>
+    <w:p>
+      <w:pPr>
+        <w:rPr>
+          <w:rFonts w:ascii="Didot" w:hAnsi="Didot" w:cs="Didot"/>
+        </w:rPr>
+      </w:pPr>
+    </w:p>
+    <w:p>
+      <w:pPr>
+        <w:pStyle w:val="Heading1"/>
+      </w:pPr>
+      <w:r>
         <w:lastRenderedPageBreak/>
+        <w:t>3 Parte Eletrônica</w:t>
+      </w:r>
+    </w:p>
+    <w:p>
+      <w:pPr>
+        <w:pStyle w:val="Heading2"/>
+      </w:pPr>
+      <w:r>
+        <w:t>3.1 Esquema do Circuito</w:t>
+      </w:r>
+    </w:p>
+    <w:p>
+      <w:pPr>
+        <w:rPr>
+          <w:rFonts w:ascii="Didot" w:hAnsi="Didot" w:cs="Didot"/>
+        </w:rPr>
+      </w:pPr>
+    </w:p>
+    <w:p>
+      <w:pPr>
+        <w:pStyle w:val="Heading2"/>
+      </w:pPr>
+      <w:r>
+        <w:t>3.2 Descrição da Escolha dos Componentes Usados</w:t>
+      </w:r>
+    </w:p>
+    <w:p>
+      <w:pPr>
+        <w:rPr>
+          <w:rFonts w:ascii="Didot" w:hAnsi="Didot" w:cs="Didot"/>
+        </w:rPr>
+      </w:pPr>
+    </w:p>
+    <w:p>
+      <w:pPr>
+        <w:rPr>
+          <w:rFonts w:ascii="Didot" w:hAnsi="Didot" w:cs="Didot"/>
+        </w:rPr>
+      </w:pPr>
+    </w:p>
+    <w:p>
+      <w:pPr>
+        <w:rPr>
+          <w:rFonts w:ascii="Didot" w:hAnsi="Didot" w:cs="Didot"/>
+        </w:rPr>
+      </w:pPr>
+    </w:p>
+    <w:p>
+      <w:pPr>
+        <w:rPr>
+          <w:rFonts w:ascii="Didot" w:hAnsi="Didot" w:cs="Didot"/>
+        </w:rPr>
+      </w:pPr>
+    </w:p>
+    <w:p>
+      <w:pPr>
+        <w:rPr>
+          <w:rFonts w:ascii="Didot" w:hAnsi="Didot" w:cs="Didot"/>
+        </w:rPr>
+      </w:pPr>
+    </w:p>
+    <w:p>
+      <w:pPr>
+        <w:rPr>
+          <w:rFonts w:ascii="Didot" w:hAnsi="Didot" w:cs="Didot"/>
+        </w:rPr>
+      </w:pPr>
+    </w:p>
+    <w:p>
+      <w:pPr>
+        <w:rPr>
+          <w:rFonts w:ascii="Didot" w:hAnsi="Didot" w:cs="Didot"/>
+        </w:rPr>
+      </w:pPr>
+    </w:p>
+    <w:p>
+      <w:pPr>
+        <w:rPr>
+          <w:rFonts w:ascii="Didot" w:hAnsi="Didot" w:cs="Didot"/>
+        </w:rPr>
+      </w:pPr>
+    </w:p>
+    <w:p>
+      <w:pPr>
+        <w:rPr>
+          <w:rFonts w:ascii="Didot" w:hAnsi="Didot" w:cs="Didot"/>
+        </w:rPr>
+      </w:pPr>
+    </w:p>
+    <w:p>
+      <w:pPr>
+        <w:rPr>
+          <w:rFonts w:ascii="Didot" w:hAnsi="Didot" w:cs="Didot"/>
+        </w:rPr>
+      </w:pPr>
+    </w:p>
+    <w:p>
+      <w:pPr>
+        <w:rPr>
+          <w:rFonts w:ascii="Didot" w:hAnsi="Didot" w:cs="Didot"/>
+        </w:rPr>
+      </w:pPr>
+    </w:p>
+    <w:p>
+      <w:pPr>
+        <w:rPr>
+          <w:rFonts w:ascii="Didot" w:hAnsi="Didot" w:cs="Didot"/>
+        </w:rPr>
+      </w:pPr>
+    </w:p>
+    <w:p>
+      <w:pPr>
+        <w:rPr>
+          <w:rFonts w:ascii="Didot" w:hAnsi="Didot" w:cs="Didot"/>
+        </w:rPr>
+      </w:pPr>
+    </w:p>
+    <w:p>
+      <w:pPr>
+        <w:rPr>
+          <w:rFonts w:ascii="Didot" w:hAnsi="Didot" w:cs="Didot"/>
+        </w:rPr>
+      </w:pPr>
+    </w:p>
+    <w:p>
+      <w:pPr>
+        <w:rPr>
+          <w:rFonts w:ascii="Didot" w:hAnsi="Didot" w:cs="Didot"/>
+        </w:rPr>
+      </w:pPr>
+    </w:p>
+    <w:p>
+      <w:pPr>
+        <w:rPr>
+          <w:rFonts w:ascii="Didot" w:hAnsi="Didot" w:cs="Didot"/>
+        </w:rPr>
+      </w:pPr>
+    </w:p>
+    <w:p>
+      <w:pPr>
+        <w:rPr>
+          <w:rFonts w:ascii="Didot" w:hAnsi="Didot" w:cs="Didot"/>
+        </w:rPr>
+      </w:pPr>
+    </w:p>
+    <w:p>
+      <w:pPr>
+        <w:rPr>
+          <w:rFonts w:ascii="Didot" w:hAnsi="Didot" w:cs="Didot"/>
+        </w:rPr>
+      </w:pPr>
+    </w:p>
+    <w:p>
+      <w:pPr>
+        <w:rPr>
+          <w:rFonts w:ascii="Didot" w:hAnsi="Didot" w:cs="Didot"/>
+        </w:rPr>
+      </w:pPr>
+    </w:p>
+    <w:p>
+      <w:pPr>
+        <w:rPr>
+          <w:rFonts w:ascii="Didot" w:hAnsi="Didot" w:cs="Didot"/>
+        </w:rPr>
+      </w:pPr>
+    </w:p>
+    <w:p>
+      <w:pPr>
+        <w:rPr>
+          <w:rFonts w:ascii="Didot" w:hAnsi="Didot" w:cs="Didot"/>
+        </w:rPr>
+      </w:pPr>
+    </w:p>
+    <w:p>
+      <w:pPr>
+        <w:rPr>
+          <w:rFonts w:ascii="Didot" w:hAnsi="Didot" w:cs="Didot"/>
+        </w:rPr>
+      </w:pPr>
+    </w:p>
+    <w:p>
+      <w:pPr>
+        <w:rPr>
+          <w:rFonts w:ascii="Didot" w:hAnsi="Didot" w:cs="Didot"/>
+        </w:rPr>
+      </w:pPr>
+    </w:p>
+    <w:p>
+      <w:pPr>
+        <w:pStyle w:val="Heading1"/>
+      </w:pPr>
+      <w:r>
+        <w:lastRenderedPageBreak/>
+        <w:t xml:space="preserve">4 </w:t>
+      </w:r>
+      <w:r>
+        <w:rPr>
+          <w:rFonts w:hint="cs"/>
+        </w:rPr>
         <w:t>Integração Eletromecânica</w:t>
       </w:r>
     </w:p>
     <w:p>
       <w:pPr>
         <w:rPr>
-          <w:rFonts w:ascii="Didot" w:hAnsi="Didot" w:cs="Didot" w:hint="cs"/>
-        </w:rPr>
-      </w:pPr>
-    </w:p>
-    <w:p>
-      <w:pPr>
-        <w:rPr>
-          <w:rFonts w:ascii="Didot" w:hAnsi="Didot" w:cs="Didot" w:hint="cs"/>
-        </w:rPr>
-      </w:pPr>
-    </w:p>
-    <w:p>
-      <w:pPr>
-        <w:rPr>
-          <w:rFonts w:ascii="Didot" w:hAnsi="Didot" w:cs="Didot" w:hint="cs"/>
-        </w:rPr>
-      </w:pPr>
-    </w:p>
-    <w:p>
-      <w:pPr>
-        <w:rPr>
-          <w:rFonts w:ascii="Didot" w:hAnsi="Didot" w:cs="Didot" w:hint="cs"/>
-        </w:rPr>
-      </w:pPr>
-    </w:p>
-    <w:p>
-      <w:pPr>
-        <w:rPr>
-          <w:rFonts w:ascii="Didot" w:hAnsi="Didot" w:cs="Didot" w:hint="cs"/>
-        </w:rPr>
-      </w:pPr>
-    </w:p>
-    <w:p>
-      <w:pPr>
-        <w:rPr>
-          <w:rFonts w:ascii="Didot" w:hAnsi="Didot" w:cs="Didot" w:hint="cs"/>
-        </w:rPr>
-      </w:pPr>
-    </w:p>
-    <w:p>
-      <w:pPr>
-        <w:rPr>
-          <w:rFonts w:ascii="Didot" w:hAnsi="Didot" w:cs="Didot" w:hint="cs"/>
-        </w:rPr>
-      </w:pPr>
-    </w:p>
-    <w:p>
-      <w:pPr>
-        <w:rPr>
-          <w:rFonts w:ascii="Didot" w:hAnsi="Didot" w:cs="Didot" w:hint="cs"/>
-        </w:rPr>
-      </w:pPr>
-    </w:p>
-    <w:p>
-      <w:pPr>
-        <w:rPr>
-          <w:rFonts w:ascii="Didot" w:hAnsi="Didot" w:cs="Didot" w:hint="cs"/>
-        </w:rPr>
-      </w:pPr>
-    </w:p>
-    <w:p>
-      <w:pPr>
-        <w:rPr>
-          <w:rFonts w:ascii="Didot" w:hAnsi="Didot" w:cs="Didot" w:hint="cs"/>
-        </w:rPr>
-      </w:pPr>
-    </w:p>
-    <w:p>
-      <w:pPr>
-        <w:rPr>
-          <w:rFonts w:ascii="Didot" w:hAnsi="Didot" w:cs="Didot" w:hint="cs"/>
-        </w:rPr>
-      </w:pPr>
-    </w:p>
-    <w:p>
-      <w:pPr>
-        <w:rPr>
-          <w:rFonts w:ascii="Didot" w:hAnsi="Didot" w:cs="Didot" w:hint="cs"/>
-        </w:rPr>
-      </w:pPr>
-    </w:p>
-    <w:p>
-      <w:pPr>
-        <w:rPr>
-          <w:rFonts w:ascii="Didot" w:hAnsi="Didot" w:cs="Didot" w:hint="cs"/>
-        </w:rPr>
-      </w:pPr>
-    </w:p>
-    <w:p>
-      <w:pPr>
-        <w:rPr>
-          <w:rFonts w:ascii="Didot" w:hAnsi="Didot" w:cs="Didot" w:hint="cs"/>
-        </w:rPr>
-      </w:pPr>
-    </w:p>
-    <w:p>
-      <w:pPr>
-        <w:rPr>
-          <w:rFonts w:ascii="Didot" w:hAnsi="Didot" w:cs="Didot" w:hint="cs"/>
-        </w:rPr>
-      </w:pPr>
-    </w:p>
-    <w:p>
-      <w:pPr>
-        <w:rPr>
-          <w:rFonts w:ascii="Didot" w:hAnsi="Didot" w:cs="Didot" w:hint="cs"/>
-        </w:rPr>
-      </w:pPr>
-    </w:p>
-    <w:p>
-      <w:pPr>
-        <w:rPr>
-          <w:rFonts w:ascii="Didot" w:hAnsi="Didot" w:cs="Didot" w:hint="cs"/>
-        </w:rPr>
-      </w:pPr>
-    </w:p>
-    <w:p>
-      <w:pPr>
-        <w:rPr>
-          <w:rFonts w:ascii="Didot" w:hAnsi="Didot" w:cs="Didot" w:hint="cs"/>
-        </w:rPr>
-      </w:pPr>
-    </w:p>
-    <w:p>
-      <w:pPr>
-        <w:rPr>
-          <w:rFonts w:ascii="Didot" w:hAnsi="Didot" w:cs="Didot" w:hint="cs"/>
-        </w:rPr>
-      </w:pPr>
-    </w:p>
-    <w:p>
-      <w:pPr>
-        <w:rPr>
-          <w:rFonts w:ascii="Didot" w:hAnsi="Didot" w:cs="Didot" w:hint="cs"/>
-        </w:rPr>
-      </w:pPr>
-    </w:p>
-    <w:p>
-      <w:pPr>
-        <w:rPr>
-          <w:rFonts w:ascii="Didot" w:hAnsi="Didot" w:cs="Didot" w:hint="cs"/>
-        </w:rPr>
-      </w:pPr>
-    </w:p>
-    <w:p>
-      <w:pPr>
-        <w:rPr>
-          <w:rFonts w:ascii="Didot" w:hAnsi="Didot" w:cs="Didot" w:hint="cs"/>
-        </w:rPr>
-      </w:pPr>
-    </w:p>
-    <w:p>
-      <w:pPr>
-        <w:rPr>
-          <w:rFonts w:ascii="Didot" w:hAnsi="Didot" w:cs="Didot" w:hint="cs"/>
-        </w:rPr>
-      </w:pPr>
-    </w:p>
-    <w:p>
-      <w:pPr>
-        <w:rPr>
-          <w:rFonts w:ascii="Didot" w:hAnsi="Didot" w:cs="Didot" w:hint="cs"/>
-        </w:rPr>
-      </w:pPr>
-    </w:p>
-    <w:p>
-      <w:pPr>
-        <w:rPr>
-          <w:rFonts w:ascii="Didot" w:hAnsi="Didot" w:cs="Didot"/>
-        </w:rPr>
-      </w:pPr>
-    </w:p>
-    <w:p>
-      <w:pPr>
-        <w:rPr>
-          <w:rFonts w:ascii="Didot" w:hAnsi="Didot" w:cs="Didot" w:hint="cs"/>
-        </w:rPr>
-      </w:pPr>
-    </w:p>
-    <w:p>
-      <w:pPr>
-        <w:rPr>
-          <w:rFonts w:ascii="Didot" w:hAnsi="Didot" w:cs="Didot" w:hint="cs"/>
-        </w:rPr>
+          <w:rFonts w:ascii="Didot" w:hAnsi="Didot" w:cs="Didot"/>
+        </w:rPr>
+      </w:pPr>
+    </w:p>
+    <w:p>
+      <w:pPr>
+        <w:rPr>
+          <w:rFonts w:ascii="Didot" w:hAnsi="Didot" w:cs="Didot"/>
+        </w:rPr>
+      </w:pPr>
+    </w:p>
+    <w:p>
+      <w:pPr>
+        <w:rPr>
+          <w:rFonts w:ascii="Didot" w:hAnsi="Didot" w:cs="Didot"/>
+        </w:rPr>
+      </w:pPr>
+    </w:p>
+    <w:p>
+      <w:pPr>
+        <w:rPr>
+          <w:rFonts w:ascii="Didot" w:hAnsi="Didot" w:cs="Didot"/>
+        </w:rPr>
+      </w:pPr>
+    </w:p>
+    <w:p>
+      <w:pPr>
+        <w:rPr>
+          <w:rFonts w:ascii="Didot" w:hAnsi="Didot" w:cs="Didot"/>
+        </w:rPr>
+      </w:pPr>
+    </w:p>
+    <w:p>
+      <w:pPr>
+        <w:rPr>
+          <w:rFonts w:ascii="Didot" w:hAnsi="Didot" w:cs="Didot"/>
+        </w:rPr>
+      </w:pPr>
+    </w:p>
+    <w:p>
+      <w:pPr>
+        <w:rPr>
+          <w:rFonts w:ascii="Didot" w:hAnsi="Didot" w:cs="Didot"/>
+        </w:rPr>
+      </w:pPr>
+    </w:p>
+    <w:p>
+      <w:pPr>
+        <w:rPr>
+          <w:rFonts w:ascii="Didot" w:hAnsi="Didot" w:cs="Didot"/>
+        </w:rPr>
+      </w:pPr>
+    </w:p>
+    <w:p>
+      <w:pPr>
+        <w:rPr>
+          <w:rFonts w:ascii="Didot" w:hAnsi="Didot" w:cs="Didot"/>
+        </w:rPr>
+      </w:pPr>
+    </w:p>
+    <w:p>
+      <w:pPr>
+        <w:rPr>
+          <w:rFonts w:ascii="Didot" w:hAnsi="Didot" w:cs="Didot"/>
+        </w:rPr>
+      </w:pPr>
+    </w:p>
+    <w:p>
+      <w:pPr>
+        <w:rPr>
+          <w:rFonts w:ascii="Didot" w:hAnsi="Didot" w:cs="Didot"/>
+        </w:rPr>
+      </w:pPr>
+    </w:p>
+    <w:p>
+      <w:pPr>
+        <w:rPr>
+          <w:rFonts w:ascii="Didot" w:hAnsi="Didot" w:cs="Didot"/>
+        </w:rPr>
+      </w:pPr>
+    </w:p>
+    <w:p>
+      <w:pPr>
+        <w:rPr>
+          <w:rFonts w:ascii="Didot" w:hAnsi="Didot" w:cs="Didot"/>
+        </w:rPr>
+      </w:pPr>
+    </w:p>
+    <w:p>
+      <w:pPr>
+        <w:rPr>
+          <w:rFonts w:ascii="Didot" w:hAnsi="Didot" w:cs="Didot"/>
+        </w:rPr>
+      </w:pPr>
+    </w:p>
+    <w:p>
+      <w:pPr>
+        <w:rPr>
+          <w:rFonts w:ascii="Didot" w:hAnsi="Didot" w:cs="Didot"/>
+        </w:rPr>
+      </w:pPr>
+    </w:p>
+    <w:p>
+      <w:pPr>
+        <w:rPr>
+          <w:rFonts w:ascii="Didot" w:hAnsi="Didot" w:cs="Didot"/>
+        </w:rPr>
+      </w:pPr>
+    </w:p>
+    <w:p>
+      <w:pPr>
+        <w:rPr>
+          <w:rFonts w:ascii="Didot" w:hAnsi="Didot" w:cs="Didot"/>
+        </w:rPr>
+      </w:pPr>
+    </w:p>
+    <w:p>
+      <w:pPr>
+        <w:rPr>
+          <w:rFonts w:ascii="Didot" w:hAnsi="Didot" w:cs="Didot"/>
+        </w:rPr>
+      </w:pPr>
+    </w:p>
+    <w:p>
+      <w:pPr>
+        <w:rPr>
+          <w:rFonts w:ascii="Didot" w:hAnsi="Didot" w:cs="Didot"/>
+        </w:rPr>
+      </w:pPr>
+    </w:p>
+    <w:p>
+      <w:pPr>
+        <w:rPr>
+          <w:rFonts w:ascii="Didot" w:hAnsi="Didot" w:cs="Didot"/>
+        </w:rPr>
+      </w:pPr>
+    </w:p>
+    <w:p>
+      <w:pPr>
+        <w:rPr>
+          <w:rFonts w:ascii="Didot" w:hAnsi="Didot" w:cs="Didot"/>
+        </w:rPr>
+      </w:pPr>
+    </w:p>
+    <w:p>
+      <w:pPr>
+        <w:rPr>
+          <w:rFonts w:ascii="Didot" w:hAnsi="Didot" w:cs="Didot"/>
+        </w:rPr>
+      </w:pPr>
+    </w:p>
+    <w:p>
+      <w:pPr>
+        <w:rPr>
+          <w:rFonts w:ascii="Didot" w:hAnsi="Didot" w:cs="Didot"/>
+        </w:rPr>
+      </w:pPr>
+    </w:p>
+    <w:p>
+      <w:pPr>
+        <w:rPr>
+          <w:rFonts w:ascii="Didot" w:hAnsi="Didot" w:cs="Didot"/>
+        </w:rPr>
+      </w:pPr>
+    </w:p>
+    <w:p>
+      <w:pPr>
+        <w:rPr>
+          <w:rFonts w:ascii="Didot" w:hAnsi="Didot" w:cs="Didot"/>
+        </w:rPr>
+      </w:pPr>
+    </w:p>
+    <w:p>
+      <w:pPr>
+        <w:rPr>
+          <w:rFonts w:ascii="Didot" w:hAnsi="Didot" w:cs="Didot"/>
+        </w:rPr>
+      </w:pPr>
+    </w:p>
+    <w:p>
+      <w:pPr>
+        <w:pStyle w:val="Heading1"/>
       </w:pPr>
       <w:r>
-        <w:rPr>
-          <w:rFonts w:ascii="Didot" w:hAnsi="Didot" w:cs="Didot" w:hint="cs"/>
-        </w:rPr>
         <w:lastRenderedPageBreak/>
+        <w:t xml:space="preserve">5 </w:t>
+      </w:r>
+      <w:r>
+        <w:rPr>
+          <w:rFonts w:hint="cs"/>
+        </w:rPr>
         <w:t>Conclusão</w:t>
       </w:r>
     </w:p>
@@ -1248,7 +1587,7 @@
     <w:link w:val="Heading1Char"/>
     <w:uiPriority w:val="9"/>
     <w:qFormat/>
-    <w:rsid w:val="00984D73"/>
+    <w:rsid w:val="00EE783B"/>
     <w:pPr>
       <w:keepNext/>
       <w:keepLines/>
@@ -1256,9 +1595,8 @@
       <w:outlineLvl w:val="0"/>
     </w:pPr>
     <w:rPr>
-      <w:rFonts w:asciiTheme="majorHAnsi" w:eastAsiaTheme="majorEastAsia" w:hAnsiTheme="majorHAnsi" w:cstheme="majorBidi"/>
-      <w:color w:val="0F4761" w:themeColor="accent1" w:themeShade="BF"/>
-      <w:sz w:val="40"/>
+      <w:rFonts w:ascii="Didot" w:eastAsiaTheme="majorEastAsia" w:hAnsi="Didot" w:cstheme="majorBidi"/>
+      <w:sz w:val="30"/>
       <w:szCs w:val="40"/>
     </w:rPr>
   </w:style>
@@ -1268,10 +1606,9 @@
     <w:next w:val="Normal"/>
     <w:link w:val="Heading2Char"/>
     <w:uiPriority w:val="9"/>
-    <w:semiHidden/>
     <w:unhideWhenUsed/>
     <w:qFormat/>
-    <w:rsid w:val="00984D73"/>
+    <w:rsid w:val="00EE783B"/>
     <w:pPr>
       <w:keepNext/>
       <w:keepLines/>
@@ -1279,9 +1616,8 @@
       <w:outlineLvl w:val="1"/>
     </w:pPr>
     <w:rPr>
-      <w:rFonts w:asciiTheme="majorHAnsi" w:eastAsiaTheme="majorEastAsia" w:hAnsiTheme="majorHAnsi" w:cstheme="majorBidi"/>
-      <w:color w:val="0F4761" w:themeColor="accent1" w:themeShade="BF"/>
-      <w:sz w:val="32"/>
+      <w:rFonts w:ascii="Didot" w:eastAsiaTheme="majorEastAsia" w:hAnsi="Didot" w:cstheme="majorBidi"/>
+      <w:sz w:val="28"/>
       <w:szCs w:val="32"/>
     </w:rPr>
   </w:style>
@@ -1472,11 +1808,10 @@
     <w:basedOn w:val="DefaultParagraphFont"/>
     <w:link w:val="Heading1"/>
     <w:uiPriority w:val="9"/>
-    <w:rsid w:val="00984D73"/>
-    <w:rPr>
-      <w:rFonts w:asciiTheme="majorHAnsi" w:eastAsiaTheme="majorEastAsia" w:hAnsiTheme="majorHAnsi" w:cstheme="majorBidi"/>
-      <w:color w:val="0F4761" w:themeColor="accent1" w:themeShade="BF"/>
-      <w:sz w:val="40"/>
+    <w:rsid w:val="00EE783B"/>
+    <w:rPr>
+      <w:rFonts w:ascii="Didot" w:eastAsiaTheme="majorEastAsia" w:hAnsi="Didot" w:cstheme="majorBidi"/>
+      <w:sz w:val="30"/>
       <w:szCs w:val="40"/>
       <w:lang w:val="pt-BR"/>
     </w:rPr>
@@ -1486,12 +1821,10 @@
     <w:basedOn w:val="DefaultParagraphFont"/>
     <w:link w:val="Heading2"/>
     <w:uiPriority w:val="9"/>
-    <w:semiHidden/>
-    <w:rsid w:val="00984D73"/>
-    <w:rPr>
-      <w:rFonts w:asciiTheme="majorHAnsi" w:eastAsiaTheme="majorEastAsia" w:hAnsiTheme="majorHAnsi" w:cstheme="majorBidi"/>
-      <w:color w:val="0F4761" w:themeColor="accent1" w:themeShade="BF"/>
-      <w:sz w:val="32"/>
+    <w:rsid w:val="00EE783B"/>
+    <w:rPr>
+      <w:rFonts w:ascii="Didot" w:eastAsiaTheme="majorEastAsia" w:hAnsi="Didot" w:cstheme="majorBidi"/>
+      <w:sz w:val="28"/>
       <w:szCs w:val="32"/>
       <w:lang w:val="pt-BR"/>
     </w:rPr>
@@ -1769,6 +2102,25 @@
       <w:color w:val="0F4761" w:themeColor="accent1" w:themeShade="BF"/>
       <w:spacing w:val="5"/>
     </w:rPr>
+  </w:style>
+  <w:style w:type="table" w:styleId="TableGrid">
+    <w:name w:val="Table Grid"/>
+    <w:basedOn w:val="TableNormal"/>
+    <w:uiPriority w:val="39"/>
+    <w:rsid w:val="00173418"/>
+    <w:pPr>
+      <w:spacing w:after="0" w:line="240" w:lineRule="auto"/>
+    </w:pPr>
+    <w:tblPr>
+      <w:tblBorders>
+        <w:top w:val="single" w:sz="4" w:space="0" w:color="auto"/>
+        <w:left w:val="single" w:sz="4" w:space="0" w:color="auto"/>
+        <w:bottom w:val="single" w:sz="4" w:space="0" w:color="auto"/>
+        <w:right w:val="single" w:sz="4" w:space="0" w:color="auto"/>
+        <w:insideH w:val="single" w:sz="4" w:space="0" w:color="auto"/>
+        <w:insideV w:val="single" w:sz="4" w:space="0" w:color="auto"/>
+      </w:tblBorders>
+    </w:tblPr>
   </w:style>
 </w:styles>
 </file>

</xml_diff>